<commit_message>
chore: freeze CampusMind course project release
</commit_message>
<xml_diff>
--- a/docs/智问校园CampusMind架构设计文档.docx
+++ b/docs/智问校园CampusMind架构设计文档.docx
@@ -247,7 +247,7 @@
           <w:sz w:val="24"/>
           <w:szCs w:val="24"/>
         </w:rPr>
-        <w:t xml:space="preserve">智问校园 CampusMind 是面向在校学生的校园事务智能问答系统，采用 AI+RAG（检索增强生成）架构：学生以自然语言提问，系统经混合检索（BM25 与向量双通道 + RRF 融合 + 重排序）从校园知识库中召回相关知识，再以可插拔生成服务（本地抽取式/云端 GLM）流式生成带引用溯源的回答。本文档完整记录了调研分析、质量属性需求、五层分层架构、七项关键架构决策（ADR）与单机到集群的演进规划。证据体系包括：62 条口语化改写评测集的四路对比（最佳 Hit@3 98.4%，生产链路 90.3%；演示环境向量通道如实为 TF-IDF 词袋，云端语义 Provider 已实现待接入）；性能拆分基准（检索 217.8 QPS/p95 8.7ms，含生成的全链路 42.0 QPS）；四项架构验收（降级/限流/热更新/兑底）全部通过，并建立从需求到证据的全链条追踪矩阵（脚本均可复现）。系统已完成可运行交付，附 60 秒前端演示录屏。</w:t>
+        <w:t xml:space="preserve">智问校园 CampusMind 是面向在校学生的校园事务智能问答系统，采用 AI+RAG（检索增强生成）架构：学生以自然语言提问，系统经混合检索（BM25 与向量双通道 + RRF 融合，重排为可配置实验开关）从校园知识库中召回相关知识，再以可插拔生成服务（本地抽取式/云端 GLM）流式生成带引用溯源的回答。本文档完整记录了调研分析、质量属性需求、五层分层架构、七项关键架构决策（ADR）与单机到集群的演进规划。证据体系包括：62 条口语化改写评测集的四路对比（默认链路 Hybrid+RRF Hit@3 98.4%，轻量重排实测无收益已降为可配置开关（默认关）；演示环境向量通道如实为 TF-IDF 词袋，云端语义 Provider 已实现待接入）；性能拆分基准（检索 251.4 QPS/p95 7.0ms，含生成的全链路 44.1 QPS）；四项架构验收（降级/限流/热更新/兑底）全部通过，并建立从需求到证据的全链条追踪矩阵（脚本均可复现）。系统已完成可运行交付，附 60 秒前端演示录屏。</w:t>
       </w:r>
     </w:p>
     <w:p>
@@ -4961,7 +4961,7 @@
           <w:sz w:val="24"/>
           <w:szCs w:val="24"/>
         </w:rPr>
-        <w:t xml:space="preserve">融合后的候选集（不截断，避免同文档双通道 chunk 挤占名额）进入重排器：演示实现为特征化轻量重排（实质词覆盖 30% + 二元词重叠 20% + 句子级重叠 35% + 同义词标签命中 15%，实质词零交集硬归零）。基于 62 条评测的实证结论：轻量词面重排无法稳定超越双通道排序，因此最终排序采用 RRF 先验为主（0.7）、重排精调为辅（0.3）的组合策略，并以重排原始分的全有或无门槛作为无知识兑底判据；排序增益的进一步提升需接入 Cross-Encoder（接口预留）。生成服务通过 GeneratorProvider 提供两种实现：本地抽取式生成器基于检索片段抽句合成并流式输出，作为零依赖演示与降级兑底；云端 GLM（openai 兼容协议）为生产推荐，提示词约束其仅依据参考资料作答。</w:t>
+        <w:t xml:space="preserve">融合后的候选集（不截断，避免同文档双通道 chunk 挤占名额）进入重排器：演示实现为特征化轻量重排（实质词覆盖 30% + 二元词重叠 20% + 句子级重叠 35% + 同义词标签命中 15%，实质词零交集硬归零）。基于 62 条评测的实证结论：轻量词面重排无法稳定超越双通道排序，因此据此默认链路为 Hybrid+RRF（含文档级去重与无知识硬零兑底），重排降级为可配置实验开关（开启时为 RRF 先验 0.7 + 重排 0.3 的组合排序与全有或无门槛）；排序增益的进一步提升需接入 Cross-Encoder（接口预留）。生成服务通过 GeneratorProvider 提供两种实现：本地抽取式生成器基于检索片段抽句合成并流式输出，作为零依赖演示与降级兑底；云端 GLM（openai 兼容协议）为生产推荐，提示词约束其仅依据参考资料作答。</w:t>
       </w:r>
     </w:p>
     <w:p>
@@ -8389,7 +8389,7 @@
           <w:sz w:val="24"/>
           <w:szCs w:val="24"/>
         </w:rPr>
-        <w:t xml:space="preserve">演进路径的核心原则是接口不变、组件可替换：从 SQLite 到 PostgreSQL、从内存索引到 Milvus/pgvector、从本地抽取式到云端 GLM、从进程内限流到 Redis，均只替换对应 Provider 或存储实现，上层编排代码零改动。</w:t>
+        <w:t xml:space="preserve">演进路径的核心原则是接口不变、组件可替换：从 SQLite 到 PostgreSQL、从内存索引到 Milvus/pgvector、从本地抽取式到云端 GLM、从进程内限流到 Redis，均只替换对应 Provider 或存储实现，上层编排代码无需改动的接口层调用。</w:t>
       </w:r>
     </w:p>
     <w:p>
@@ -9586,7 +9586,7 @@
                 <w:sz w:val="21"/>
                 <w:szCs w:val="21"/>
               </w:rPr>
-              <w:t xml:space="preserve">Hybrid+RRF（无重排）</w:t>
+              <w:t xml:space="preserve">Hybrid+RRF（生产默认）</w:t>
             </w:r>
           </w:p>
         </w:tc>
@@ -9648,7 +9648,7 @@
                 <w:sz w:val="21"/>
                 <w:szCs w:val="21"/>
               </w:rPr>
-              <w:t xml:space="preserve">95.2%</w:t>
+              <w:t xml:space="preserve">98.4%</w:t>
             </w:r>
           </w:p>
         </w:tc>
@@ -9679,7 +9679,7 @@
                 <w:sz w:val="21"/>
                 <w:szCs w:val="21"/>
               </w:rPr>
-              <w:t xml:space="preserve">0.863</w:t>
+              <w:t xml:space="preserve">0.884</w:t>
             </w:r>
           </w:p>
         </w:tc>
@@ -9715,7 +9715,7 @@
                 <w:sz w:val="21"/>
                 <w:szCs w:val="21"/>
               </w:rPr>
-              <w:t xml:space="preserve">Hybrid+Rerank（生产链路）</w:t>
+              <w:t xml:space="preserve">Hybrid+Rerank（可选实验开关，默认关）</w:t>
             </w:r>
           </w:p>
         </w:tc>
@@ -9829,7 +9829,7 @@
           <w:sz w:val="24"/>
           <w:szCs w:val="24"/>
         </w:rPr>
-        <w:t xml:space="preserve">评测驱动的调优过程发现并修复了三个真实缺陷：① 停用词表构造 bug（整串未分割导致过滤从未生效，虚词污染重排特征）；② RRF 融合候选池截断压缩文档多样性；③ 输出缺少文档级去重（同一文档双通道 chunk 挤占 Top-K 名额，亦为引用卡片重复来源之根因）。修复后生产链路 Hit@3 由初版评估的 82.3% 提升至 90.3%。同时得到一项实证结论：轻量词面重排无法稳定超越双通道排序，其价值主要在质量控制（兑底阈值）；排序增益的进一步提升需接入 Cross-Encoder，已列入演进规划。</w:t>
+        <w:t xml:space="preserve">评测驱动的调优过程发现并修复了三个真实缺陷：① 停用词表构造 bug（整串未分割导致过滤从未生效，虚词污染重排特征）；② RRF 融合候选池截断压缩文档多样性；③ 输出缺少文档级去重（同一文档双通道 chunk 挤占 Top-K 名额，亦为引用卡片重复来源之根因）。基于上述实测结果，系统默认检索链路确定为 Hybrid+RRF（含文档级去重与无知识硬零兑底），轻量词面 Reranker 实测无收益，降级为可配置实验开关（RERANK_ENABLED，默认关闭），保持 Provider 化设计，计划替换为 Cross-Encoder 后再次评估。口径说明：四路统一为文档级去重口径；早期 RRF 评测存在同文档重复占位失真（旧值 Hit@3 95.2%），统一口径后实测 98.4%，以此为准。</w:t>
       </w:r>
     </w:p>
     <w:p>
@@ -10183,7 +10183,7 @@
                 <w:sz w:val="21"/>
                 <w:szCs w:val="21"/>
               </w:rPr>
-              <w:t xml:space="preserve">retrieval-only（进程内）</w:t>
+              <w:t xml:space="preserve">retrieval-only（进程内，默认 RRF 链路）</w:t>
             </w:r>
           </w:p>
         </w:tc>
@@ -10245,7 +10245,7 @@
                 <w:sz w:val="21"/>
                 <w:szCs w:val="21"/>
               </w:rPr>
-              <w:t xml:space="preserve">217.8</w:t>
+              <w:t xml:space="preserve">251.4</w:t>
             </w:r>
           </w:p>
         </w:tc>
@@ -10276,7 +10276,7 @@
                 <w:sz w:val="21"/>
                 <w:szCs w:val="21"/>
               </w:rPr>
-              <w:t xml:space="preserve">4.1ms</w:t>
+              <w:t xml:space="preserve">3.4ms</w:t>
             </w:r>
           </w:p>
         </w:tc>
@@ -10307,7 +10307,7 @@
                 <w:sz w:val="21"/>
                 <w:szCs w:val="21"/>
               </w:rPr>
-              <w:t xml:space="preserve">8.7ms</w:t>
+              <w:t xml:space="preserve">7.0ms</w:t>
             </w:r>
           </w:p>
         </w:tc>
@@ -10338,7 +10338,7 @@
                 <w:sz w:val="21"/>
                 <w:szCs w:val="21"/>
               </w:rPr>
-              <w:t xml:space="preserve">9.5ms</w:t>
+              <w:t xml:space="preserve">7.2ms</w:t>
             </w:r>
           </w:p>
         </w:tc>
@@ -10467,7 +10467,7 @@
                 <w:sz w:val="21"/>
                 <w:szCs w:val="21"/>
               </w:rPr>
-              <w:t xml:space="preserve">42.0</w:t>
+              <w:t xml:space="preserve">44.1</w:t>
             </w:r>
           </w:p>
         </w:tc>
@@ -10498,7 +10498,7 @@
                 <w:sz w:val="21"/>
                 <w:szCs w:val="21"/>
               </w:rPr>
-              <w:t xml:space="preserve">436ms</w:t>
+              <w:t xml:space="preserve">415.7ms</w:t>
             </w:r>
           </w:p>
         </w:tc>
@@ -10529,7 +10529,7 @@
                 <w:sz w:val="21"/>
                 <w:szCs w:val="21"/>
               </w:rPr>
-              <w:t xml:space="preserve">632ms</w:t>
+              <w:t xml:space="preserve">601.0ms</w:t>
             </w:r>
           </w:p>
         </w:tc>
@@ -10560,7 +10560,7 @@
                 <w:sz w:val="21"/>
                 <w:szCs w:val="21"/>
               </w:rPr>
-              <w:t xml:space="preserve">683ms</w:t>
+              <w:t xml:space="preserve">611.1ms</w:t>
             </w:r>
           </w:p>
         </w:tc>
@@ -10612,7 +10612,7 @@
           <w:sz w:val="24"/>
           <w:szCs w:val="24"/>
         </w:rPr>
-        <w:t xml:space="preserve">E2E 吞吐较早期 67.8 QPS 下降，原因是本轮修复后检索链路更完整（候选池 4 倍、文档级去重、组合排序），以准确性优先，数据如实呈现。</w:t>
+        <w:t xml:space="preserve">历史对照：Rerank 默认时期 retrieval-only 217.8 QPS（p95 8.7ms）、E2E 42.0 QPS（p99 683ms）；初版链路 E2E 67.8 QPS。默认切换至 RRF 后检索计算量下降，吞吐回升，数据如实呈现。</w:t>
       </w:r>
     </w:p>
     <w:p>
@@ -11725,7 +11725,7 @@
                 <w:sz w:val="21"/>
                 <w:szCs w:val="21"/>
               </w:rPr>
-              <w:t xml:space="preserve">ADR-2/4</w:t>
+              <w:t xml:space="preserve">ADR-2/7</w:t>
             </w:r>
           </w:p>
         </w:tc>
@@ -11818,7 +11818,7 @@
                 <w:sz w:val="21"/>
                 <w:szCs w:val="21"/>
               </w:rPr>
-              <w:t xml:space="preserve">Hit@3 90.3%；引用卡片展示双通道排名</w:t>
+              <w:t xml:space="preserve">默认链路 Hit@3 98.4%；引用卡片展示双通道排名</w:t>
             </w:r>
           </w:p>
         </w:tc>

</xml_diff>

<commit_message>
docs: fill team roster (Wang Ruozhang, He Li, Guo Zuoliang) across deliverables
</commit_message>
<xml_diff>
--- a/docs/智问校园CampusMind架构设计文档.docx
+++ b/docs/智问校园CampusMind架构设计文档.docx
@@ -145,7 +145,7 @@
                 <w:sz w:val="36"/>
                 <w:szCs w:val="36"/>
               </w:rPr>
-              <w:t xml:space="preserve">项目团队：CampusMind 项目组（3–5 人）</w:t>
+              <w:t xml:space="preserve">项目团队：王若璋（组长/架构） · 何俐 · 郭祚梁</w:t>
             </w:r>
           </w:p>
           <w:p>
@@ -4581,7 +4581,7 @@
           <w:sz w:val="24"/>
           <w:szCs w:val="24"/>
         </w:rPr>
-        <w:t xml:space="preserve">项目面临四项关键约束：（1）课程周期仅 8 周，团队 3–5 人，不允许重型微服务全家桶式试错；（2）学生环境预算有限，云资源与大型商业模型不可作为演示的硬依赖；（3）校园信息具有权威口径，回答必须可溯源、不得编造；（4）需在普通笔记本上一键启动演示。这些约束直接塑造了第 4 章的架构选型与第 8 章的决策。</w:t>
+        <w:t xml:space="preserve">项目面临四项关键约束：（1）课程周期仅 8 周，团队 3 人，不允许重型微服务全家桶式试错；（2）学生环境预算有限，云资源与大型商业模型不可作为演示的硬依赖；（3）校园信息具有权威口径，回答必须可溯源、不得编造；（4）需在普通笔记本上一键启动演示。这些约束直接塑造了第 4 章的架构选型与第 8 章的决策。</w:t>
       </w:r>
     </w:p>
     <w:p>
@@ -8407,7 +8407,7 @@
           <w:sz w:val="21"/>
           <w:szCs w:val="21"/>
         </w:rPr>
-        <w:t xml:space="preserve">表 10-1  8 周迭代计划与团队分工（3–5 人）</w:t>
+        <w:t xml:space="preserve">表 10-1  8 周迭代计划与团队分工（3 人）</w:t>
       </w:r>
     </w:p>
     <w:tbl>
@@ -8628,7 +8628,7 @@
                 <w:sz w:val="21"/>
                 <w:szCs w:val="21"/>
               </w:rPr>
-              <w:t xml:space="preserve">架构师牵头，全员参与</w:t>
+              <w:t xml:space="preserve">王若璋（架构）牵头，全员参与</w:t>
             </w:r>
           </w:p>
         </w:tc>
@@ -8726,7 +8726,7 @@
                 <w:sz w:val="21"/>
                 <w:szCs w:val="21"/>
               </w:rPr>
-              <w:t xml:space="preserve">后端工程×2、数据运营</w:t>
+              <w:t xml:space="preserve">后端/数据（何俐）</w:t>
             </w:r>
           </w:p>
         </w:tc>
@@ -8824,7 +8824,7 @@
                 <w:sz w:val="21"/>
                 <w:szCs w:val="21"/>
               </w:rPr>
-              <w:t xml:space="preserve">前端工程、后端工程</w:t>
+              <w:t xml:space="preserve">前端（郭祚梁）、后端（何俐）</w:t>
             </w:r>
           </w:p>
         </w:tc>
@@ -8922,7 +8922,7 @@
                 <w:sz w:val="21"/>
                 <w:szCs w:val="21"/>
               </w:rPr>
-              <w:t xml:space="preserve">全员，测试牵头</w:t>
+              <w:t xml:space="preserve">全员，王若璋（测试）牵头</w:t>
             </w:r>
           </w:p>
         </w:tc>

</xml_diff>